<commit_message>
Second review revision: fix count inconsistency, std-dev figures, EVN classification, Konzernprivileg footnote
Corrections: (1) PIERER is the 11th case (not 12th) — bereinigte Gesamtzahl 11 incl. PIERER. (2) Standardabweichung ATX 194 (war 215); DAX 4365 (war 4318). Mittelwert ergänzt. (3) EVN als Beteiligungsertrag (Equity-Method-Anteil) statt Pro-rata-Dividende klassifiziert, neuer V.1-Bullet. (4) Konzernprivileg-Klassifikation Porsche AG / Siemens Healthineers mit Fußnote über teleologische vs textliche Auslegung von § 111a Abs 3 Nr 1 dAktG ergänzt. (5) Aggregationsregel präziser formuliert.

https://claude.ai/code/session_01MupZGxtfmmq5kh4amezkAH
</commit_message>
<xml_diff>
--- a/analysis/RWZ_Beitrag_RPT_final.docx
+++ b/analysis/RWZ_Beitrag_RPT_final.docx
@@ -441,7 +441,7 @@
       </w:r>
     </w:p>
     <w:bookmarkEnd w:id="23"/>
-    <w:bookmarkStart w:id="29" w:name="ii.-die-schwellenwerte-normativ"/>
+    <w:bookmarkStart w:id="30" w:name="ii.-die-schwellenwerte-normativ"/>
     <w:p>
       <w:pPr>
         <w:pStyle w:val="Heading1"/>
@@ -450,7 +450,7 @@
         <w:t xml:space="preserve">II. Die Schwellenwerte normativ</w:t>
       </w:r>
     </w:p>
-    <w:bookmarkStart w:id="25" w:name="österreich-95a-aktg-idf-akträg-2019"/>
+    <w:bookmarkStart w:id="26" w:name="österreich-95a-aktg-idf-akträg-2019"/>
     <w:p>
       <w:pPr>
         <w:pStyle w:val="Heading2"/>
@@ -646,13 +646,19 @@
           <w:bCs/>
           <w:b/>
         </w:rPr>
-        <w:t xml:space="preserve">12-Monats-Aggregation</w:t>
-      </w:r>
-      <w:r>
-        <w:t xml:space="preserve"> </w:t>
-      </w:r>
-      <w:r>
-        <w:t xml:space="preserve">verhindert eine bewusste Zerlegung größerer Transaktionen in kleinere Teilgeschäfte zur Umgehung des Tatbestands.</w:t>
+        <w:t xml:space="preserve">Aggregationsregel</w:t>
+      </w:r>
+      <w:r>
+        <w:t xml:space="preserve"> </w:t>
+      </w:r>
+      <w:r>
+        <w:t xml:space="preserve">verhindert eine bewusste Zerlegung größerer Transaktionen in kleinere Teilgeschäfte zur Umgehung des Tatbestands: Geschäfte mit derselben nahestehenden Person, die innerhalb des laufenden Geschäftsjahres abgeschlossen werden, sind in ihrem Wert zu summieren.</w:t>
+      </w:r>
+      <w:r>
+        <w:rPr>
+          <w:rStyle w:val="FootnoteReference"/>
+        </w:rPr>
+        <w:footnoteReference w:id="25"/>
       </w:r>
     </w:p>
     <w:p>
@@ -741,8 +747,8 @@
         <w:t xml:space="preserve">sind in § 95d AktG geregelt; sie umfassen insbesondere Geschäfte mit vollkonsolidierten Tochterunternehmen, Geschäfte im ordentlichen Geschäftsgang zu marktüblichen Bedingungen, sowie Vorgänge, die der Gleichbehandlung aller Aktionäre dienen (insbesondere anteilige Dividenden, eigene Aktien, Kapitalmaßnahmen).</w:t>
       </w:r>
     </w:p>
-    <w:bookmarkEnd w:id="25"/>
-    <w:bookmarkStart w:id="27" w:name="deutschland-111b-abs-1-daktg-idf-arug-ii"/>
+    <w:bookmarkEnd w:id="26"/>
+    <w:bookmarkStart w:id="28" w:name="deutschland-111b-abs-1-daktg-idf-arug-ii"/>
     <w:p>
       <w:pPr>
         <w:pStyle w:val="Heading2"/>
@@ -778,7 +784,7 @@
         <w:rPr>
           <w:rStyle w:val="FootnoteReference"/>
         </w:rPr>
-        <w:footnoteReference w:id="26"/>
+        <w:footnoteReference w:id="27"/>
       </w:r>
       <w:r>
         <w:t xml:space="preserve"> </w:t>
@@ -795,8 +801,8 @@
         <w:t xml:space="preserve">Die übrige Architektur ist parallel: § 111b Abs 2 dAktG normiert die Zustimmungspflicht des Aufsichtsrats oder eines hierfür eingerichteten Ausschusses, § 111c dAktG die Veröffentlichungspflicht. Die Ausnahmen sind nicht in einer eigenen Norm (wie § 95d AktG in Österreich) konsolidiert, sondern in § 111a Abs 3 dAktG verankert. Sie umfassen — wiederum funktional parallel — Geschäfte mit Tochterunternehmen (Z 1), Geschäfte im ordentlichen Geschäftsgang zu marktüblichen Bedingungen (Z 2), Geschäfte, die einem Ausschüttungsanspruch entsprechen, der allen Aktionären zusteht (Z 3), Geschäfte in Bezug auf eigene Aktien (Z 4) sowie bestimmte Bank- und Versicherungsgeschäfte (Z 5).</w:t>
       </w:r>
     </w:p>
-    <w:bookmarkEnd w:id="27"/>
-    <w:bookmarkStart w:id="28" w:name="vergleichende-übersicht"/>
+    <w:bookmarkEnd w:id="28"/>
+    <w:bookmarkStart w:id="29" w:name="vergleichende-übersicht"/>
     <w:p>
       <w:pPr>
         <w:pStyle w:val="Heading2"/>
@@ -1157,9 +1163,9 @@
         </w:tc>
       </w:tr>
     </w:tbl>
-    <w:bookmarkEnd w:id="28"/>
     <w:bookmarkEnd w:id="29"/>
-    <w:bookmarkStart w:id="30" w:name="Xd4e4b4fbb7275e713d8e778e70dbc1985449dc8"/>
+    <w:bookmarkEnd w:id="30"/>
+    <w:bookmarkStart w:id="31" w:name="Xd4e4b4fbb7275e713d8e778e70dbc1985449dc8"/>
     <w:p>
       <w:pPr>
         <w:pStyle w:val="Heading1"/>
@@ -1388,8 +1394,8 @@
         <w:t xml:space="preserve">Mit diesen drei Klärungen wird der empirische Befund in Abschnitt IV. fundiert: Ohne die Übersetzung der prozentualen Norm in absolute Beträge bleibt der rechtsvergleichende Schwellenvergleich oberflächlich und unter Umständen irreführend.</w:t>
       </w:r>
     </w:p>
-    <w:bookmarkEnd w:id="30"/>
-    <w:bookmarkStart w:id="31" w:name="Xdb4022b66707d53fdb98025a0126b6d519eb955"/>
+    <w:bookmarkEnd w:id="31"/>
+    <w:bookmarkStart w:id="32" w:name="Xdb4022b66707d53fdb98025a0126b6d519eb955"/>
     <w:p>
       <w:pPr>
         <w:pStyle w:val="Heading1"/>
@@ -1642,7 +1648,7 @@
               <w:jc w:val="left"/>
             </w:pPr>
             <w:r>
-              <w:t xml:space="preserve">75-%-Quantil</w:t>
+              <w:t xml:space="preserve">Mittelwert</w:t>
             </w:r>
           </w:p>
         </w:tc>
@@ -1654,7 +1660,7 @@
               <w:jc w:val="right"/>
             </w:pPr>
             <w:r>
-              <w:t xml:space="preserve">206</w:t>
+              <w:t xml:space="preserve">172</w:t>
             </w:r>
           </w:p>
         </w:tc>
@@ -1666,7 +1672,7 @@
               <w:jc w:val="right"/>
             </w:pPr>
             <w:r>
-              <w:t xml:space="preserve">2.008</w:t>
+              <w:t xml:space="preserve">2.519</w:t>
             </w:r>
           </w:p>
         </w:tc>
@@ -1680,7 +1686,7 @@
               <w:jc w:val="left"/>
             </w:pPr>
             <w:r>
-              <w:t xml:space="preserve">Maximum</w:t>
+              <w:t xml:space="preserve">75-%-Quantil</w:t>
             </w:r>
           </w:p>
         </w:tc>
@@ -1692,7 +1698,7 @@
               <w:jc w:val="right"/>
             </w:pPr>
             <w:r>
-              <w:t xml:space="preserve">850 (OMV)</w:t>
+              <w:t xml:space="preserve">207</w:t>
             </w:r>
           </w:p>
         </w:tc>
@@ -1704,7 +1710,7 @@
               <w:jc w:val="right"/>
             </w:pPr>
             <w:r>
-              <w:t xml:space="preserve">20.925 (Deutsche Bank)</w:t>
+              <w:t xml:space="preserve">2.008</w:t>
             </w:r>
           </w:p>
         </w:tc>
@@ -1718,6 +1724,44 @@
               <w:jc w:val="left"/>
             </w:pPr>
             <w:r>
+              <w:t xml:space="preserve">Maximum</w:t>
+            </w:r>
+          </w:p>
+        </w:tc>
+        <w:tc>
+          <w:tcPr/>
+          <w:p>
+            <w:pPr>
+              <w:pStyle w:val="Compact"/>
+              <w:jc w:val="right"/>
+            </w:pPr>
+            <w:r>
+              <w:t xml:space="preserve">850 (OMV)</w:t>
+            </w:r>
+          </w:p>
+        </w:tc>
+        <w:tc>
+          <w:tcPr/>
+          <w:p>
+            <w:pPr>
+              <w:pStyle w:val="Compact"/>
+              <w:jc w:val="right"/>
+            </w:pPr>
+            <w:r>
+              <w:t xml:space="preserve">20.925 (Deutsche Bank)</w:t>
+            </w:r>
+          </w:p>
+        </w:tc>
+      </w:tr>
+      <w:tr>
+        <w:tc>
+          <w:tcPr/>
+          <w:p>
+            <w:pPr>
+              <w:pStyle w:val="Compact"/>
+              <w:jc w:val="left"/>
+            </w:pPr>
+            <w:r>
               <w:t xml:space="preserve">Standardabweichung</w:t>
             </w:r>
           </w:p>
@@ -1730,7 +1774,7 @@
               <w:jc w:val="right"/>
             </w:pPr>
             <w:r>
-              <w:t xml:space="preserve">215</w:t>
+              <w:t xml:space="preserve">194</w:t>
             </w:r>
           </w:p>
         </w:tc>
@@ -1742,7 +1786,7 @@
               <w:jc w:val="right"/>
             </w:pPr>
             <w:r>
-              <w:t xml:space="preserve">4.318</w:t>
+              <w:t xml:space="preserve">4.365</w:t>
             </w:r>
           </w:p>
         </w:tc>
@@ -1793,7 +1837,23 @@
         <w:t xml:space="preserve"> </w:t>
       </w:r>
       <w:r>
-        <w:t xml:space="preserve">dem DAX-Median (EUR 108 Mio. gegenüber EUR 1.000 Mio., Faktor 9,3×). Die</w:t>
+        <w:t xml:space="preserve">dem DAX-Median (EUR 108 Mio. gegenüber EUR 1.000 Mio., Faktor 9,3×). Der</w:t>
+      </w:r>
+      <w:r>
+        <w:t xml:space="preserve"> </w:t>
+      </w:r>
+      <w:r>
+        <w:rPr>
+          <w:iCs/>
+          <w:i/>
+        </w:rPr>
+        <w:t xml:space="preserve">arithmetische Mittelwert</w:t>
+      </w:r>
+      <w:r>
+        <w:t xml:space="preserve"> </w:t>
+      </w:r>
+      <w:r>
+        <w:t xml:space="preserve">zeigt einen noch deutlicheren Abstand (EUR 172 Mio. vs EUR 2.519 Mio., Faktor 14,6×); er wird allerdings stärker von den DAX-Extremwerten (Allianz, Deutsche Bank, Volkswagen) verzerrt und ist daher rechtsvergleichend weniger aussagekräftig als der Median. Die</w:t>
       </w:r>
       <w:r>
         <w:t xml:space="preserve"> </w:t>
@@ -1809,7 +1869,7 @@
         <w:t xml:space="preserve"> </w:t>
       </w:r>
       <w:r>
-        <w:t xml:space="preserve">ist im DAX zudem deutlich breiter (Standardabweichung EUR 4,3 Mrd. gegenüber EUR 215 Mio. im ATX), was die Heterogenität des DAX zwischen kleineren Spezialwerten (Qiagen, Symrise, Zalando) und Großbanken/Versicherern (Deutsche Bank, Allianz) widerspiegelt.</w:t>
+        <w:t xml:space="preserve">ist im DAX deutlich breiter (Standardabweichung EUR 4,4 Mrd. gegenüber EUR 194 Mio. im ATX), was die Heterogenität des DAX zwischen kleineren Spezialwerten (Qiagen, Symrise, Zalando) und Großbanken/Versicherern (Deutsche Bank, Allianz) widerspiegelt.</w:t>
       </w:r>
     </w:p>
     <w:p>
@@ -1897,8 +1957,8 @@
         <w:t xml:space="preserve">Zusammen führen beide Effekte zu dem in Abbildung 1 visualisierten Bild: Die Verteilung der absoluten Schwellen im ATX (orange) und im DAX (blau) überlappt sich nur schwach im mittleren Bereich; die Mediane sind durch fast eine Größenordnung getrennt.</w:t>
       </w:r>
     </w:p>
-    <w:bookmarkEnd w:id="31"/>
-    <w:bookmarkStart w:id="37" w:name="X23c738757b487251da0d95c76ae5c6c3d0ce10e"/>
+    <w:bookmarkEnd w:id="32"/>
+    <w:bookmarkStart w:id="40" w:name="X23c738757b487251da0d95c76ae5c6c3d0ce10e"/>
     <w:p>
       <w:pPr>
         <w:pStyle w:val="Heading1"/>
@@ -1907,7 +1967,7 @@
         <w:t xml:space="preserve">V. Welche Geschäfte überschreiten die Schwelle?</w:t>
       </w:r>
     </w:p>
-    <w:bookmarkStart w:id="33" w:name="X5058d47d3c3a9f9b94ebbf51cf2488cc01ccd4e"/>
+    <w:bookmarkStart w:id="34" w:name="X5058d47d3c3a9f9b94ebbf51cf2488cc01ccd4e"/>
     <w:p>
       <w:pPr>
         <w:pStyle w:val="Heading2"/>
@@ -2075,7 +2135,7 @@
         <w:t xml:space="preserve"> </w:t>
       </w:r>
       <w:r>
-        <w:t xml:space="preserve">auch als ausgeschlossen — präziser formuliert: als außerhalb des Tatbestands. § 95d AktG enthält die parallele Ausschließung.</w:t>
+        <w:t xml:space="preserve">als ausgeschlossen — präziser formuliert: als außerhalb des Tatbestands. § 95d AktG enthält die parallele Ausschließung.</w:t>
       </w:r>
     </w:p>
     <w:p>
@@ -2091,45 +2151,47 @@
           <w:bCs/>
           <w:b/>
         </w:rPr>
-        <w:t xml:space="preserve">Bestandsgrößen aus früheren Geschäftsabschlüssen.</w:t>
-      </w:r>
-      <w:r>
-        <w:t xml:space="preserve"> </w:t>
-      </w:r>
-      <w:r>
-        <w:t xml:space="preserve">§ 95a AktG / § 111a dAktG knüpft an</w:t>
-      </w:r>
-      <w:r>
-        <w:t xml:space="preserve"> </w:t>
-      </w:r>
-      <w:r>
-        <w:rPr>
-          <w:iCs/>
-          <w:i/>
-        </w:rPr>
-        <w:t xml:space="preserve">abgeschlossene Geschäfte</w:t>
-      </w:r>
-      <w:r>
-        <w:t xml:space="preserve"> </w:t>
-      </w:r>
-      <w:r>
-        <w:t xml:space="preserve">an. Eine bilanzielle Forderung oder Verbindlichkeit, die aus einer in einem früheren Jahr abgeschlossenen Transaktion stammt (etwa eine Sale-and-Leaseback-Verbindlichkeit aus 2023 oder eine konzerninterne Finanzverbindlichkeit aus den 1980er Jahren), erfüllt im laufenden Berichtsjahr keinen</w:t>
-      </w:r>
-      <w:r>
-        <w:t xml:space="preserve"> </w:t>
-      </w:r>
-      <w:r>
-        <w:rPr>
-          <w:iCs/>
-          <w:i/>
-        </w:rPr>
-        <w:t xml:space="preserve">neuen</w:t>
-      </w:r>
-      <w:r>
-        <w:t xml:space="preserve"> </w:t>
-      </w:r>
-      <w:r>
-        <w:t xml:space="preserve">Tatbestand. Der Tatbestand war bei Abschluss zu prüfen, nicht jährlich neu.</w:t>
+        <w:t xml:space="preserve">Beteiligungserträge aus Equity-Method-Anteilen.</w:t>
+      </w:r>
+      <w:r>
+        <w:t xml:space="preserve"> </w:t>
+      </w:r>
+      <w:r>
+        <w:t xml:space="preserve">Wenn die Emittentin als</w:t>
+      </w:r>
+      <w:r>
+        <w:t xml:space="preserve"> </w:t>
+      </w:r>
+      <w:r>
+        <w:rPr>
+          <w:iCs/>
+          <w:i/>
+        </w:rPr>
+        <w:t xml:space="preserve">Anteilseignerin</w:t>
+      </w:r>
+      <w:r>
+        <w:t xml:space="preserve"> </w:t>
+      </w:r>
+      <w:r>
+        <w:t xml:space="preserve">an einer assoziierten Gesellschaft Dividenden empfängt, ist dies ein passiver Investmentertrag, der bereits an der Ausschüttungsquelle pro-rata erfolgt; sie schließt mit der ausschüttenden Gesellschaft kein bilaterales</w:t>
+      </w:r>
+      <w:r>
+        <w:t xml:space="preserve"> </w:t>
+      </w:r>
+      <w:r>
+        <w:t xml:space="preserve">“</w:t>
+      </w:r>
+      <w:r>
+        <w:t xml:space="preserve">Geschäft</w:t>
+      </w:r>
+      <w:r>
+        <w:t xml:space="preserve">”</w:t>
+      </w:r>
+      <w:r>
+        <w:t xml:space="preserve"> </w:t>
+      </w:r>
+      <w:r>
+        <w:t xml:space="preserve">ab. Konsistent mit der vorgenannten Tatbestandsabgrenzung liegt eine Empfangs-Dividende von einer assoziierten Gesellschaft mithin ebenfalls außerhalb des § 95a/§ 111a-Tatbestands.</w:t>
       </w:r>
     </w:p>
     <w:p>
@@ -2145,64 +2207,134 @@
           <w:bCs/>
           <w:b/>
         </w:rPr>
-        <w:t xml:space="preserve">Vorstandsvergütungen</w:t>
-      </w:r>
-      <w:r>
-        <w:t xml:space="preserve"> </w:t>
-      </w:r>
-      <w:r>
-        <w:t xml:space="preserve">sind nach § 95a AktG bzw § 111a dAktG eigens ausgenommen, weil ihre Transparenz durch den separat veröffentlichten Vergütungsbericht (§ 78c AktG / § 162 dAktG) gewährleistet ist.</w:t>
-      </w:r>
-    </w:p>
-    <w:p>
-      <w:pPr>
-        <w:pStyle w:val="FirstParagraph"/>
-      </w:pPr>
-      <w:r>
-        <w:t xml:space="preserve">Diese drei Fallgruppen sind aus dem empirischen Test ausgeklammert.</w:t>
-      </w:r>
-      <w:r>
-        <w:rPr>
-          <w:rStyle w:val="FootnoteReference"/>
-        </w:rPr>
-        <w:footnoteReference w:id="32"/>
-      </w:r>
-      <w:r>
-        <w:t xml:space="preserve"> </w:t>
-      </w:r>
-      <w:r>
-        <w:t xml:space="preserve">Eine ungeprüfte Aufnahme würde den Befund quantitativ aufblähen, ohne ihn rechtlich aussagekräftiger zu machen.</w:t>
-      </w:r>
-    </w:p>
-    <w:bookmarkEnd w:id="33"/>
-    <w:bookmarkStart w:id="34" w:name="X34de07f0df28e91df786f3b48ba2f743bf7010d"/>
-    <w:p>
-      <w:pPr>
-        <w:pStyle w:val="Heading2"/>
-      </w:pPr>
-      <w:r>
-        <w:t xml:space="preserve">2. Bereinigte Liste der nominellen Überschreiter</w:t>
-      </w:r>
-    </w:p>
-    <w:p>
-      <w:pPr>
-        <w:pStyle w:val="FirstParagraph"/>
-      </w:pPr>
-      <w:r>
-        <w:t xml:space="preserve">Nach Bereinigung um Pro-rata-Dividenden (5 Fälle: CA Immo, Verbund, EVN-empfangene Dividende vom Verbund-Beteiligungsunternehmen, Porsche SE, Erste Group) und Bestandsgrößen aus früheren Jahren (2 Fälle: Merck KGaA, Deutsche Telekom) verbleiben</w:t>
-      </w:r>
-      <w:r>
-        <w:t xml:space="preserve"> </w:t>
-      </w:r>
+        <w:t xml:space="preserve">Bestandsgrößen aus früheren Geschäftsabschlüssen.</w:t>
+      </w:r>
+      <w:r>
+        <w:t xml:space="preserve"> </w:t>
+      </w:r>
+      <w:r>
+        <w:t xml:space="preserve">§ 95a AktG / § 111a dAktG knüpft an</w:t>
+      </w:r>
+      <w:r>
+        <w:t xml:space="preserve"> </w:t>
+      </w:r>
+      <w:r>
+        <w:rPr>
+          <w:iCs/>
+          <w:i/>
+        </w:rPr>
+        <w:t xml:space="preserve">abgeschlossene Geschäfte</w:t>
+      </w:r>
+      <w:r>
+        <w:t xml:space="preserve"> </w:t>
+      </w:r>
+      <w:r>
+        <w:t xml:space="preserve">an. Eine bilanzielle Forderung oder Verbindlichkeit, die aus einer in einem früheren Jahr abgeschlossenen Transaktion stammt (etwa eine Sale-and-Leaseback-Verbindlichkeit aus 2023 oder eine konzerninterne Finanzverbindlichkeit aus den 1980er Jahren), erfüllt im laufenden Berichtsjahr keinen</w:t>
+      </w:r>
+      <w:r>
+        <w:t xml:space="preserve"> </w:t>
+      </w:r>
+      <w:r>
+        <w:rPr>
+          <w:iCs/>
+          <w:i/>
+        </w:rPr>
+        <w:t xml:space="preserve">neuen</w:t>
+      </w:r>
+      <w:r>
+        <w:t xml:space="preserve"> </w:t>
+      </w:r>
+      <w:r>
+        <w:t xml:space="preserve">Tatbestand. Der Tatbestand war bei Abschluss zu prüfen, nicht jährlich neu.</w:t>
+      </w:r>
+    </w:p>
+    <w:p>
+      <w:pPr>
+        <w:numPr>
+          <w:ilvl w:val="0"/>
+          <w:numId w:val="1004"/>
+        </w:numPr>
+        <w:pStyle w:val="Compact"/>
+      </w:pPr>
       <w:r>
         <w:rPr>
           <w:bCs/>
           <w:b/>
         </w:rPr>
+        <w:t xml:space="preserve">Vorstandsvergütungen</w:t>
+      </w:r>
+      <w:r>
+        <w:t xml:space="preserve"> </w:t>
+      </w:r>
+      <w:r>
+        <w:t xml:space="preserve">sind nach § 95a AktG bzw § 111a dAktG eigens ausgenommen, weil ihre Transparenz durch den separat veröffentlichten Vergütungsbericht (§ 78c AktG / § 162 dAktG) gewährleistet ist.</w:t>
+      </w:r>
+    </w:p>
+    <w:p>
+      <w:pPr>
+        <w:pStyle w:val="FirstParagraph"/>
+      </w:pPr>
+      <w:r>
+        <w:t xml:space="preserve">Diese vier Fallgruppen sind aus dem empirischen Test ausgeklammert.</w:t>
+      </w:r>
+      <w:r>
+        <w:rPr>
+          <w:rStyle w:val="FootnoteReference"/>
+        </w:rPr>
+        <w:footnoteReference w:id="33"/>
+      </w:r>
+      <w:r>
+        <w:t xml:space="preserve"> </w:t>
+      </w:r>
+      <w:r>
+        <w:t xml:space="preserve">Eine ungeprüfte Aufnahme würde den Befund quantitativ aufblähen, ohne ihn rechtlich aussagekräftiger zu machen.</w:t>
+      </w:r>
+    </w:p>
+    <w:bookmarkEnd w:id="34"/>
+    <w:bookmarkStart w:id="37" w:name="X34de07f0df28e91df786f3b48ba2f743bf7010d"/>
+    <w:p>
+      <w:pPr>
+        <w:pStyle w:val="Heading2"/>
+      </w:pPr>
+      <w:r>
+        <w:t xml:space="preserve">2. Bereinigte Liste der nominellen Überschreiter</w:t>
+      </w:r>
+    </w:p>
+    <w:p>
+      <w:pPr>
+        <w:pStyle w:val="FirstParagraph"/>
+      </w:pPr>
+      <w:r>
+        <w:t xml:space="preserve">Nach Bereinigung um Pro-rata-Dividenden (vier Fälle: CA Immo, Verbund, Porsche SE, Erste Group), um Beteiligungserträge aus Equity-Method-Anteilen (ein Fall: EVN — die EUR 182 Mio. sind eine</w:t>
+      </w:r>
+      <w:r>
+        <w:t xml:space="preserve"> </w:t>
+      </w:r>
+      <w:r>
+        <w:rPr>
+          <w:iCs/>
+          <w:i/>
+        </w:rPr>
+        <w:t xml:space="preserve">empfangene</w:t>
+      </w:r>
+      <w:r>
+        <w:t xml:space="preserve"> </w:t>
+      </w:r>
+      <w:r>
+        <w:t xml:space="preserve">Dividende aus EVN’s Equity-Method-Beteiligungen an Verbund-Innkraftwerken; ein Beteiligungsertrag, der bereits an seiner Quelle pro-rata an alle Anteilseigner ausgeschüttet wird und der bei EVN als Investmentertrag, nicht als RP-Geschäft erscheint) sowie um Bestandsgrößen aus früheren Geschäftsjahren (zwei Fälle: Merck KGaA, Deutsche Telekom) verbleiben</w:t>
+      </w:r>
+      <w:r>
+        <w:t xml:space="preserve"> </w:t>
+      </w:r>
+      <w:r>
+        <w:rPr>
+          <w:bCs/>
+          <w:b/>
+        </w:rPr>
         <w:t xml:space="preserve">elf Emittenten</w:t>
       </w:r>
       <w:r>
-        <w:t xml:space="preserve">, deren größter quantifiziert offengelegter RPT-Einzelposten den bindenden Schwellenwert numerisch überschreitet (Tabelle 2). Hinzu kommt ein zwölfter Sonderfall — PIERER Mobility — dessen Einordnung sub specie § 95a AktG offen ist und im Folgenden gesondert erörtert wird.</w:t>
+        <w:t xml:space="preserve">, deren größter quantifiziert offengelegter RPT-Einzelposten den bindenden Schwellenwert numerisch überschreitet (Tabelle 2). Einer dieser elf Fälle — PIERER Mobility — wird wegen der besonderen Konstellation einer im Berichtsjahr erfolgten Dekonsolidierung gesondert in Abschnitt V.3 erörtert.</w:t>
       </w:r>
     </w:p>
     <w:p>
@@ -2575,7 +2707,19 @@
               <w:jc w:val="left"/>
             </w:pPr>
             <w:r>
-              <w:t xml:space="preserve">Konzernprivileg (Tochterunternehmen)</w:t>
+              <w:t xml:space="preserve">Konzernprivileg</w:t>
+            </w:r>
+            <w:r>
+              <w:rPr>
+                <w:rStyle w:val="FootnoteReference"/>
+              </w:rPr>
+              <w:footnoteReference w:id="35"/>
+            </w:r>
+            <w:r>
+              <w:t xml:space="preserve"> </w:t>
+            </w:r>
+            <w:r>
+              <w:t xml:space="preserve">(Cash-Pool mit VW als Mehrheitsgesellschafter)</w:t>
             </w:r>
           </w:p>
         </w:tc>
@@ -2663,6 +2807,18 @@
             <w:r>
               <w:t xml:space="preserve">Konzernprivileg</w:t>
             </w:r>
+            <w:r>
+              <w:rPr>
+                <w:rStyle w:val="FootnoteReference"/>
+              </w:rPr>
+              <w:footnoteReference w:id="36"/>
+            </w:r>
+            <w:r>
+              <w:t xml:space="preserve"> </w:t>
+            </w:r>
+            <w:r>
+              <w:t xml:space="preserve">(Treasury mit Siemens AG als Mehrheitsgesellschafter)</w:t>
+            </w:r>
           </w:p>
         </w:tc>
       </w:tr>
@@ -3091,7 +3247,7 @@
               <w:jc w:val="left"/>
             </w:pPr>
             <w:r>
-              <w:t xml:space="preserve">Konzernprivileg</w:t>
+              <w:t xml:space="preserve">Konzernprivileg (UNIQA Re als vollkonsolidierte Tochter)</w:t>
             </w:r>
           </w:p>
         </w:tc>
@@ -3191,7 +3347,7 @@
               <w:jc w:val="right"/>
             </w:pPr>
             <w:r>
-              <w:t xml:space="preserve">(Sonderfall)</w:t>
+              <w:t xml:space="preserve">11</w:t>
             </w:r>
           </w:p>
         </w:tc>
@@ -3263,7 +3419,7 @@
               <w:jc w:val="left"/>
             </w:pPr>
             <w:r>
-              <w:t xml:space="preserve">offen — siehe V.3</w:t>
+              <w:t xml:space="preserve">offen — Sonderfall Dekonsolidierung, siehe V.3</w:t>
             </w:r>
           </w:p>
         </w:tc>
@@ -3274,7 +3430,7 @@
         <w:pStyle w:val="BodyText"/>
       </w:pPr>
       <w:r>
-        <w:t xml:space="preserve">Die quantitative Verteilung der einschlägigen Ausnahmen ist eindeutig:</w:t>
+        <w:t xml:space="preserve">Die quantitative Verteilung der einschlägigen Ausnahmegründe über die elf Fälle ist eindeutig:</w:t>
       </w:r>
       <w:r>
         <w:t xml:space="preserve"> </w:t>
@@ -3284,13 +3440,13 @@
           <w:bCs/>
           <w:b/>
         </w:rPr>
-        <w:t xml:space="preserve">Sechs</w:t>
-      </w:r>
-      <w:r>
-        <w:t xml:space="preserve"> </w:t>
-      </w:r>
-      <w:r>
-        <w:t xml:space="preserve">der elf Fälle (55 %) werden durch die Ausnahme</w:t>
+        <w:t xml:space="preserve">sechs</w:t>
+      </w:r>
+      <w:r>
+        <w:t xml:space="preserve"> </w:t>
+      </w:r>
+      <w:r>
+        <w:t xml:space="preserve">Fälle (55 %) werden durch die Ausnahme</w:t>
       </w:r>
       <w:r>
         <w:t xml:space="preserve"> </w:t>
@@ -3324,7 +3480,7 @@
         <w:t xml:space="preserve"> </w:t>
       </w:r>
       <w:r>
-        <w:t xml:space="preserve">Fälle (27 %) durch das Konzernprivileg für Tochterunternehmen; in</w:t>
+        <w:t xml:space="preserve">Fälle (27 %) durch das Konzernprivileg; in</w:t>
       </w:r>
       <w:r>
         <w:t xml:space="preserve"> </w:t>
@@ -3340,11 +3496,27 @@
         <w:t xml:space="preserve"> </w:t>
       </w:r>
       <w:r>
-        <w:t xml:space="preserve">Fall (Siemens Energy) ist die Ausnahme nicht einschlägig — der Emittent hat dort tatsächlich eine § 111c-Bekanntmachung publiziert (allerdings im Dezember 2023, also vor dem Kalenderjahr 2024).</w:t>
-      </w:r>
-    </w:p>
-    <w:bookmarkEnd w:id="34"/>
-    <w:bookmarkStart w:id="35" w:name="der-sonderfall-pierer-mobility"/>
+        <w:t xml:space="preserve">Fall (Siemens Energy) ist keiner der gesetzlichen Ausnahmetatbestände einschlägig — der Emittent hat dort tatsächlich eine § 111c-Bekanntmachung publiziert (allerdings im Dezember 2023, also vor dem Kalenderjahr 2024); ein</w:t>
+      </w:r>
+      <w:r>
+        <w:t xml:space="preserve"> </w:t>
+      </w:r>
+      <w:r>
+        <w:rPr>
+          <w:bCs/>
+          <w:b/>
+        </w:rPr>
+        <w:t xml:space="preserve">elfter</w:t>
+      </w:r>
+      <w:r>
+        <w:t xml:space="preserve"> </w:t>
+      </w:r>
+      <w:r>
+        <w:t xml:space="preserve">Fall (PIERER Mobility) bleibt rechtlich offen und wird unter V.3 erörtert.</w:t>
+      </w:r>
+    </w:p>
+    <w:bookmarkEnd w:id="37"/>
+    <w:bookmarkStart w:id="38" w:name="der-sonderfall-pierer-mobility"/>
     <w:p>
       <w:pPr>
         <w:pStyle w:val="Heading2"/>
@@ -3525,8 +3697,8 @@
         <w:t xml:space="preserve">Bekanntmachung nach § 95c AktG publiziert. Die § 95a-/§ 95c-Bewertung der Dekonsolidierung bleibt damit ungeklärt und stellt aus Sicht des Verfassers eine offene methodische Frage dar, die für die Verwendung der Ausnahmegründe in vergleichbaren Carve-out-Konstellationen Bedeutung hat.</w:t>
       </w:r>
     </w:p>
-    <w:bookmarkEnd w:id="35"/>
-    <w:bookmarkStart w:id="36" w:name="Xef38cf0e852d8b17038ef9c71b6b07933bf3dc1"/>
+    <w:bookmarkEnd w:id="38"/>
+    <w:bookmarkStart w:id="39" w:name="Xef38cf0e852d8b17038ef9c71b6b07933bf3dc1"/>
     <w:p>
       <w:pPr>
         <w:pStyle w:val="Heading2"/>
@@ -3606,9 +3778,9 @@
         <w:t xml:space="preserve">Bestätigung der Reichweite dieser Ausnahme über mehrjährige Rahmenverträge mit JV-Partnern existiert weder in Österreich noch in Deutschland; die in der Lehre vereinzelt geäußerten Bedenken sind bisher nicht justiziabel geworden. Diese Selbstauskunftsstruktur ist im Anwendungsdiskurs zu berücksichtigen.</w:t>
       </w:r>
     </w:p>
-    <w:bookmarkEnd w:id="36"/>
-    <w:bookmarkEnd w:id="37"/>
-    <w:bookmarkStart w:id="38" w:name="X78f085059707aee88e0dc310ab9978f8a684206"/>
+    <w:bookmarkEnd w:id="39"/>
+    <w:bookmarkEnd w:id="40"/>
+    <w:bookmarkStart w:id="41" w:name="X78f085059707aee88e0dc310ab9978f8a684206"/>
     <w:p>
       <w:pPr>
         <w:pStyle w:val="Heading1"/>
@@ -3731,8 +3903,8 @@
         <w:t xml:space="preserve">von der laufenden IAS-24-Anhangangabe getragen, nicht von der ARUG-II-/AktRÄG-2019-Architektur. Diese Beobachtung verdient eine differenzierte Würdigung.</w:t>
       </w:r>
     </w:p>
-    <w:bookmarkEnd w:id="38"/>
-    <w:bookmarkStart w:id="39" w:name="X514296e295cf6fa45bc9913dbc0f9ed4f923ae1"/>
+    <w:bookmarkEnd w:id="41"/>
+    <w:bookmarkStart w:id="42" w:name="X514296e295cf6fa45bc9913dbc0f9ed4f923ae1"/>
     <w:p>
       <w:pPr>
         <w:pStyle w:val="Heading1"/>
@@ -3912,8 +4084,8 @@
         <w:t xml:space="preserve">(§ 111a Abs 3 Nr 4 dAktG) hat im hier untersuchten Datensatz keine Bedeutung erlangt — Rückkaufprogramme wurden im IAS-24-Anhang regelmäßig nicht als RPT-Vorgang ausgewiesen.</w:t>
       </w:r>
     </w:p>
-    <w:bookmarkEnd w:id="39"/>
-    <w:bookmarkStart w:id="40" w:name="X570867c981af39b8c1a2c84038857f5b320662e"/>
+    <w:bookmarkEnd w:id="42"/>
+    <w:bookmarkStart w:id="43" w:name="X570867c981af39b8c1a2c84038857f5b320662e"/>
     <w:p>
       <w:pPr>
         <w:pStyle w:val="Heading1"/>
@@ -3970,8 +4142,8 @@
         <w:t xml:space="preserve">In der ATX-Population sind die Vertretungen der nahestehenden Person im Aufsichtsrat in einer ganzen Reihe von Konstellationen signifikant: voestalpine (Kernaktionärssyndikat), Verbund (Republik Österreich + Landesbeteiligungen), Erste Group (ERSTE-Stiftung), Wienerberger (ANC Privatstiftung), CA Immo (Starwood). Im DAX gilt Vergleichbares für Henkel (Familienpool), Beiersdorf (maxingvest), Merck KGaA (E.-Merck-KG-Familienpool), Porsche AG (VW als Mehrheitsaktionär), Volkswagen (Porsche/Piëch-Familie via Porsche SE; Land Niedersachsen). Eine systematische Erhebung der Anteile der nicht-RP-Mitglieder im jeweiligen Prüfungsausschuss würde den Rahmen dieses Beitrags sprengen; die Frage, ob die existierende Governance-Architektur den Genehmigungsvorbehalt materiell trägt oder formal aushöhlt, wäre ein ergiebiges Folgethema.</w:t>
       </w:r>
     </w:p>
-    <w:bookmarkEnd w:id="40"/>
-    <w:bookmarkStart w:id="41" w:name="ix.-diskussion-und-schlussfolgerungen"/>
+    <w:bookmarkEnd w:id="43"/>
+    <w:bookmarkStart w:id="44" w:name="ix.-diskussion-und-schlussfolgerungen"/>
     <w:p>
       <w:pPr>
         <w:pStyle w:val="Heading1"/>
@@ -4325,8 +4497,8 @@
         <w:t xml:space="preserve">zu berechnen und die Anwendung der Ausnahmegründe in der Anhangangabe ausdrücklich zu benennen. Eine Praxis, die in den FY2024-Berichten erst von wenigen Emittenten (insbesondere Volkswagen, Porsche AG, Siemens Energy, BASF) konsequent geübt wird.</w:t>
       </w:r>
     </w:p>
-    <w:bookmarkEnd w:id="41"/>
-    <w:bookmarkStart w:id="42" w:name="x.-praktische-empfehlungen"/>
+    <w:bookmarkEnd w:id="44"/>
+    <w:bookmarkStart w:id="45" w:name="x.-praktische-empfehlungen"/>
     <w:p>
       <w:pPr>
         <w:pStyle w:val="Heading1"/>
@@ -4543,7 +4715,7 @@
         </w:pict>
       </w:r>
     </w:p>
-    <w:bookmarkEnd w:id="42"/>
+    <w:bookmarkEnd w:id="45"/>
     <w:sectPr/>
   </w:body>
 </w:document>
@@ -4645,7 +4817,7 @@
       </w:r>
     </w:p>
   </w:footnote>
-  <w:footnote w:id="26">
+  <w:footnote w:id="25">
     <w:p>
       <w:pPr>
         <w:pStyle w:val="FootnoteText"/>
@@ -4660,11 +4832,46 @@
         <w:t xml:space="preserve"> </w:t>
       </w:r>
       <w:r>
+        <w:t xml:space="preserve">Vgl. SRD II Art 9c Abs 4 sowie die nationalen Umsetzungen in § 95a AktG (AT) bzw § 111b Abs 1 Satz 2 dAktG (DE). Die Aggregation bezieht sich auf gleichartige Geschäfte</w:t>
+      </w:r>
+      <w:r>
+        <w:t xml:space="preserve"> </w:t>
+      </w:r>
+      <w:r>
+        <w:rPr>
+          <w:iCs/>
+          <w:i/>
+        </w:rPr>
+        <w:t xml:space="preserve">mit derselben nahestehenden Person</w:t>
+      </w:r>
+      <w:r>
+        <w:t xml:space="preserve"> </w:t>
+      </w:r>
+      <w:r>
+        <w:t xml:space="preserve">innerhalb des laufenden Geschäftsjahres.</w:t>
+      </w:r>
+    </w:p>
+  </w:footnote>
+  <w:footnote w:id="27">
+    <w:p>
+      <w:pPr>
+        <w:pStyle w:val="FootnoteText"/>
+      </w:pPr>
+      <w:r>
+        <w:rPr>
+          <w:rStyle w:val="FootnoteReference"/>
+        </w:rPr>
+        <w:footnoteRef/>
+      </w:r>
+      <w:r>
+        <w:t xml:space="preserve"> </w:t>
+      </w:r>
+      <w:r>
         <w:t xml:space="preserve">§ 111b Abs 1 Satz 1 dAktG idF ARUG II.</w:t>
       </w:r>
     </w:p>
   </w:footnote>
-  <w:footnote w:id="32">
+  <w:footnote w:id="33">
     <w:p>
       <w:pPr>
         <w:pStyle w:val="FootnoteText"/>
@@ -4679,7 +4886,7 @@
         <w:t xml:space="preserve"> </w:t>
       </w:r>
       <w:r>
-        <w:t xml:space="preserve">Die hier praktizierte Bereinigung wirkt strenger als der bloße Tatbestandsausschluss nahelegt: Pro-rata-Dividenden, Altbestände und Vorstandsvergütungen werden</w:t>
+        <w:t xml:space="preserve">Die hier praktizierte Bereinigung wirkt strenger als der bloße Tatbestandsausschluss nahelegt: Pro-rata-Dividenden, Beteiligungserträge aus Equity-Method-Anteilen, Altbestände und Vorstandsvergütungen werden</w:t>
       </w:r>
       <w:r>
         <w:t xml:space="preserve"> </w:t>
@@ -4695,7 +4902,201 @@
         <w:t xml:space="preserve"> </w:t>
       </w:r>
       <w:r>
-        <w:t xml:space="preserve">aus dem empirischen Test ausgeschlossen. Im Ergebnis reduziert sich die Zahl der nominellen Überschreitungen von 18 (Rohdaten) auf 11 (bereinigt), zuzüglich des Sonderfalls PIERER Mobility.</w:t>
+        <w:t xml:space="preserve">aus dem empirischen Test ausgeschlossen. Im Ergebnis reduziert sich die Zahl der nominellen Überschreitungen von 18 (Rohdaten) auf 11 (bereinigt; einschließlich PIERER Mobility als Sonderfall).</w:t>
+      </w:r>
+    </w:p>
+  </w:footnote>
+  <w:footnote w:id="35">
+    <w:p>
+      <w:pPr>
+        <w:pStyle w:val="FootnoteText"/>
+      </w:pPr>
+      <w:r>
+        <w:rPr>
+          <w:rStyle w:val="FootnoteReference"/>
+        </w:rPr>
+        <w:footnoteRef/>
+      </w:r>
+      <w:r>
+        <w:t xml:space="preserve"> </w:t>
+      </w:r>
+      <w:r>
+        <w:t xml:space="preserve">Die Anwendung des Konzernprivilegs (§ 95d Z 1 AktG bzw § 111a Abs 3 Nr 1 dAktG) auf Geschäfte mit dem</w:t>
+      </w:r>
+      <w:r>
+        <w:t xml:space="preserve"> </w:t>
+      </w:r>
+      <w:r>
+        <w:rPr>
+          <w:iCs/>
+          <w:i/>
+        </w:rPr>
+        <w:t xml:space="preserve">Mutterunternehmen</w:t>
+      </w:r>
+      <w:r>
+        <w:t xml:space="preserve"> </w:t>
+      </w:r>
+      <w:r>
+        <w:t xml:space="preserve">ist nicht unstreitig. § 111a Abs 3 Nr 1 dAktG erfasst nach dem Wortlaut</w:t>
+      </w:r>
+      <w:r>
+        <w:t xml:space="preserve"> </w:t>
+      </w:r>
+      <w:r>
+        <w:t xml:space="preserve">“</w:t>
+      </w:r>
+      <w:r>
+        <w:t xml:space="preserve">Geschäfte mit Tochterunternehmen</w:t>
+      </w:r>
+      <w:r>
+        <w:t xml:space="preserve">”</w:t>
+      </w:r>
+      <w:r>
+        <w:t xml:space="preserve">. Eine strikt-textliche Auslegung würde Konzern-Cash-Pools und Konzern-Treasury-Strukturen, in denen die börsenotierte Gesellschaft</w:t>
+      </w:r>
+      <w:r>
+        <w:t xml:space="preserve"> </w:t>
+      </w:r>
+      <w:r>
+        <w:rPr>
+          <w:iCs/>
+          <w:i/>
+        </w:rPr>
+        <w:t xml:space="preserve">Schuldnerin</w:t>
+      </w:r>
+      <w:r>
+        <w:t xml:space="preserve"> </w:t>
+      </w:r>
+      <w:r>
+        <w:t xml:space="preserve">ihrer eigenen Mutter ist, nicht erfassen; sie müssten dann auf die Ausnahme</w:t>
+      </w:r>
+      <w:r>
+        <w:t xml:space="preserve"> </w:t>
+      </w:r>
+      <w:r>
+        <w:t xml:space="preserve">“</w:t>
+      </w:r>
+      <w:r>
+        <w:t xml:space="preserve">ordentlicher Geschäftsgang</w:t>
+      </w:r>
+      <w:r>
+        <w:t xml:space="preserve">”</w:t>
+      </w:r>
+      <w:r>
+        <w:t xml:space="preserve"> </w:t>
+      </w:r>
+      <w:r>
+        <w:t xml:space="preserve">gestützt werden. Die in Lehre und Praxis vorherrschende teleologische Lesart erfasst beide Richtungen — das</w:t>
+      </w:r>
+      <w:r>
+        <w:t xml:space="preserve"> </w:t>
+      </w:r>
+      <w:r>
+        <w:rPr>
+          <w:iCs/>
+          <w:i/>
+        </w:rPr>
+        <w:t xml:space="preserve">Konzern</w:t>
+      </w:r>
+      <w:r>
+        <w:t xml:space="preserve">verhältnis steht im Vordergrund, nicht die Richtung des Leistungsflusses. Die in Tabelle 2 verwendete Klassifikation folgt der teleologischen Lesart.</w:t>
+      </w:r>
+    </w:p>
+  </w:footnote>
+  <w:footnote w:id="36">
+    <w:p>
+      <w:pPr>
+        <w:pStyle w:val="FootnoteText"/>
+      </w:pPr>
+      <w:r>
+        <w:rPr>
+          <w:rStyle w:val="FootnoteReference"/>
+        </w:rPr>
+        <w:footnoteRef/>
+      </w:r>
+      <w:r>
+        <w:t xml:space="preserve"> </w:t>
+      </w:r>
+      <w:r>
+        <w:t xml:space="preserve">Die Anwendung des Konzernprivilegs (§ 95d Z 1 AktG bzw § 111a Abs 3 Nr 1 dAktG) auf Geschäfte mit dem</w:t>
+      </w:r>
+      <w:r>
+        <w:t xml:space="preserve"> </w:t>
+      </w:r>
+      <w:r>
+        <w:rPr>
+          <w:iCs/>
+          <w:i/>
+        </w:rPr>
+        <w:t xml:space="preserve">Mutterunternehmen</w:t>
+      </w:r>
+      <w:r>
+        <w:t xml:space="preserve"> </w:t>
+      </w:r>
+      <w:r>
+        <w:t xml:space="preserve">ist nicht unstreitig. § 111a Abs 3 Nr 1 dAktG erfasst nach dem Wortlaut</w:t>
+      </w:r>
+      <w:r>
+        <w:t xml:space="preserve"> </w:t>
+      </w:r>
+      <w:r>
+        <w:t xml:space="preserve">“</w:t>
+      </w:r>
+      <w:r>
+        <w:t xml:space="preserve">Geschäfte mit Tochterunternehmen</w:t>
+      </w:r>
+      <w:r>
+        <w:t xml:space="preserve">”</w:t>
+      </w:r>
+      <w:r>
+        <w:t xml:space="preserve">. Eine strikt-textliche Auslegung würde Konzern-Cash-Pools und Konzern-Treasury-Strukturen, in denen die börsenotierte Gesellschaft</w:t>
+      </w:r>
+      <w:r>
+        <w:t xml:space="preserve"> </w:t>
+      </w:r>
+      <w:r>
+        <w:rPr>
+          <w:iCs/>
+          <w:i/>
+        </w:rPr>
+        <w:t xml:space="preserve">Schuldnerin</w:t>
+      </w:r>
+      <w:r>
+        <w:t xml:space="preserve"> </w:t>
+      </w:r>
+      <w:r>
+        <w:t xml:space="preserve">ihrer eigenen Mutter ist, nicht erfassen; sie müssten dann auf die Ausnahme</w:t>
+      </w:r>
+      <w:r>
+        <w:t xml:space="preserve"> </w:t>
+      </w:r>
+      <w:r>
+        <w:t xml:space="preserve">“</w:t>
+      </w:r>
+      <w:r>
+        <w:t xml:space="preserve">ordentlicher Geschäftsgang</w:t>
+      </w:r>
+      <w:r>
+        <w:t xml:space="preserve">”</w:t>
+      </w:r>
+      <w:r>
+        <w:t xml:space="preserve"> </w:t>
+      </w:r>
+      <w:r>
+        <w:t xml:space="preserve">gestützt werden. Die in Lehre und Praxis vorherrschende teleologische Lesart erfasst beide Richtungen — das</w:t>
+      </w:r>
+      <w:r>
+        <w:t xml:space="preserve"> </w:t>
+      </w:r>
+      <w:r>
+        <w:rPr>
+          <w:iCs/>
+          <w:i/>
+        </w:rPr>
+        <w:t xml:space="preserve">Konzern</w:t>
+      </w:r>
+      <w:r>
+        <w:t xml:space="preserve">verhältnis steht im Vordergrund, nicht die Richtung des Leistungsflusses. Die in Tabelle 2 verwendete Klassifikation folgt der teleologischen Lesart.</w:t>
       </w:r>
     </w:p>
   </w:footnote>

</xml_diff>